<commit_message>
Actualizacion de trabajo realizado
se añadio objetivos (general y especificos)

Samuel Perez
</commit_message>
<xml_diff>
--- a/DOCUMENTACION/Documentacion para proyecto final de ANALISIS Y DESARROLLO DE SOFTWARE.docx
+++ b/DOCUMENTACION/Documentacion para proyecto final de ANALISIS Y DESARROLLO DE SOFTWARE.docx
@@ -576,22 +576,346 @@
         <w:spacing w:line="480" w:lineRule="auto"/>
         <w:rPr>
           <w:rFonts w:ascii="Times New Roman" w:hAnsi="Times New Roman" w:cs="Times New Roman"/>
+          <w:lang w:val="es-MX"/>
+        </w:rPr>
+      </w:pPr>
+      <w:r>
+        <w:rPr>
+          <w:rFonts w:ascii="Times New Roman" w:hAnsi="Times New Roman" w:cs="Times New Roman"/>
+          <w:lang w:val="es-MX"/>
+        </w:rPr>
+        <w:t xml:space="preserve">¿Cómo diseñar e implementar una plataforma de comercio electrónico para Calzado Cúcuta Store que permita gestionar eficientemente el inventario, ofrecer múltiples pasarelas de pago y mejorar la experiencia de compra de los clientes a nivel nacional? Actualmente, la tienda, ubicada físicamente en la ciudad de Cúcuta, Norte de Santander, enfrenta limitaciones significativas debido a la ausencia de un canal digital, dependiendo exclusivamente de la atención presencial y ventas locales, lo que reduce su alcance comercial y limita sus ingresos al no poder atender clientes en otras regiones del país. Además, el control de inventario se realiza de forma manual, generando errores en el registro de existencias, desabastecimiento de productos con alta demanda y acumulación de stock no vendido. Por otra parte, los métodos de pago son restringidos, dificultando que los clientes realicen compras de manera ágil y segura, especialmente aquellos que prefieren pagos electrónicos. Esta situación provoca pérdida de oportunidades de venta, insatisfacción en los clientes y una gestión ineficiente de los recursos del negocio. Por lo tanto, se hace necesario implementar una solución tecnológica que, a través de una interfaz desarrollada en </w:t>
+      </w:r>
+      <w:proofErr w:type="spellStart"/>
+      <w:r>
+        <w:rPr>
+          <w:rFonts w:ascii="Times New Roman" w:hAnsi="Times New Roman" w:cs="Times New Roman"/>
+          <w:lang w:val="es-MX"/>
+        </w:rPr>
+        <w:t>React</w:t>
+      </w:r>
+      <w:proofErr w:type="spellEnd"/>
+      <w:r>
+        <w:rPr>
+          <w:rFonts w:ascii="Times New Roman" w:hAnsi="Times New Roman" w:cs="Times New Roman"/>
+          <w:lang w:val="es-MX"/>
+        </w:rPr>
+        <w:t xml:space="preserve"> con HTML, CSS y JSX, integre un sistema de inventario automatizado y múltiples opciones de pago, permitiendo así expandir la operación comercial a todo el territorio colombiano y posicionando a Calzado Cúcuta Store en el entorno digital nacional.</w:t>
+      </w:r>
+    </w:p>
+    <w:p>
+      <w:pPr>
+        <w:spacing w:line="480" w:lineRule="auto"/>
+        <w:rPr>
+          <w:rFonts w:ascii="Times New Roman" w:hAnsi="Times New Roman" w:cs="Times New Roman"/>
+          <w:lang w:val="es-MX"/>
+        </w:rPr>
+      </w:pPr>
+    </w:p>
+    <w:p>
+      <w:pPr>
+        <w:spacing w:line="480" w:lineRule="auto"/>
+        <w:rPr>
+          <w:rFonts w:ascii="Times New Roman" w:hAnsi="Times New Roman" w:cs="Times New Roman"/>
+          <w:lang w:val="es-MX"/>
+        </w:rPr>
+      </w:pPr>
+    </w:p>
+    <w:p>
+      <w:pPr>
+        <w:spacing w:line="480" w:lineRule="auto"/>
+        <w:rPr>
+          <w:rFonts w:ascii="Times New Roman" w:hAnsi="Times New Roman" w:cs="Times New Roman"/>
+          <w:lang w:val="es-MX"/>
+        </w:rPr>
+      </w:pPr>
+    </w:p>
+    <w:p>
+      <w:pPr>
+        <w:spacing w:line="480" w:lineRule="auto"/>
+        <w:rPr>
+          <w:rFonts w:ascii="Times New Roman" w:hAnsi="Times New Roman" w:cs="Times New Roman"/>
+          <w:b/>
+          <w:bCs/>
+          <w:lang w:val="es-MX"/>
+        </w:rPr>
+      </w:pPr>
+      <w:r>
+        <w:rPr>
+          <w:rFonts w:ascii="Times New Roman" w:hAnsi="Times New Roman" w:cs="Times New Roman"/>
+          <w:b/>
+          <w:bCs/>
+          <w:lang w:val="es-MX"/>
+        </w:rPr>
+        <w:lastRenderedPageBreak/>
+        <w:t>Justificación</w:t>
+      </w:r>
+    </w:p>
+    <w:p>
+      <w:pPr>
+        <w:spacing w:line="480" w:lineRule="auto"/>
+        <w:rPr>
+          <w:rFonts w:ascii="Times New Roman" w:hAnsi="Times New Roman" w:cs="Times New Roman"/>
+          <w:b/>
+          <w:bCs/>
           <w:u w:val="single"/>
           <w:lang w:val="es-MX"/>
         </w:rPr>
       </w:pPr>
-      <w:r>
-        <w:rPr>
-          <w:rFonts w:ascii="Times New Roman" w:hAnsi="Times New Roman" w:cs="Times New Roman"/>
-          <w:lang w:val="es-MX"/>
-        </w:rPr>
-        <w:t xml:space="preserve">¿Cómo diseñar e implementar una plataforma de comercio electrónico para Calzado Cúcuta Store que permita gestionar eficientemente el inventario, ofrecer múltiples pasarelas de pago y mejorar la experiencia de compra de los clientes a nivel nacional? Actualmente, la tienda, ubicada físicamente en la ciudad de Cúcuta, Norte de Santander, enfrenta limitaciones significativas debido a la ausencia de un canal digital, dependiendo exclusivamente de la atención presencial y ventas locales, lo que reduce su alcance comercial y limita sus ingresos al no poder atender clientes en otras regiones del país. Además, el control de inventario se realiza de forma manual, generando errores en el registro de existencias, desabastecimiento de productos con alta demanda y acumulación de stock no vendido. Por otra parte, los métodos de pago son restringidos, dificultando que los clientes realicen compras de manera ágil y segura, especialmente aquellos que prefieren pagos electrónicos. Esta situación provoca pérdida de oportunidades de venta, insatisfacción en los clientes y una gestión ineficiente de los recursos del negocio. Por lo tanto, se hace necesario implementar una solución tecnológica que, a través de una interfaz desarrollada en </w:t>
+    </w:p>
+    <w:p>
+      <w:pPr>
+        <w:spacing w:line="480" w:lineRule="auto"/>
+        <w:rPr>
+          <w:rFonts w:ascii="Times New Roman" w:hAnsi="Times New Roman" w:cs="Times New Roman"/>
+          <w:b/>
+          <w:bCs/>
+          <w:u w:val="single"/>
+          <w:lang w:val="es-MX"/>
+        </w:rPr>
+      </w:pPr>
+    </w:p>
+    <w:p>
+      <w:pPr>
+        <w:spacing w:line="480" w:lineRule="auto"/>
+        <w:rPr>
+          <w:rFonts w:ascii="Times New Roman" w:hAnsi="Times New Roman" w:cs="Times New Roman"/>
+          <w:b/>
+          <w:bCs/>
+          <w:u w:val="single"/>
+          <w:lang w:val="es-MX"/>
+        </w:rPr>
+      </w:pPr>
+    </w:p>
+    <w:p>
+      <w:pPr>
+        <w:spacing w:line="480" w:lineRule="auto"/>
+        <w:rPr>
+          <w:rFonts w:ascii="Times New Roman" w:hAnsi="Times New Roman" w:cs="Times New Roman"/>
+          <w:b/>
+          <w:bCs/>
+          <w:u w:val="single"/>
+          <w:lang w:val="es-MX"/>
+        </w:rPr>
+      </w:pPr>
+    </w:p>
+    <w:p>
+      <w:pPr>
+        <w:spacing w:line="480" w:lineRule="auto"/>
+        <w:rPr>
+          <w:rFonts w:ascii="Times New Roman" w:hAnsi="Times New Roman" w:cs="Times New Roman"/>
+          <w:b/>
+          <w:bCs/>
+          <w:u w:val="single"/>
+          <w:lang w:val="es-MX"/>
+        </w:rPr>
+      </w:pPr>
+    </w:p>
+    <w:p>
+      <w:pPr>
+        <w:spacing w:line="480" w:lineRule="auto"/>
+        <w:rPr>
+          <w:rFonts w:ascii="Times New Roman" w:hAnsi="Times New Roman" w:cs="Times New Roman"/>
+          <w:b/>
+          <w:bCs/>
+          <w:u w:val="single"/>
+          <w:lang w:val="es-MX"/>
+        </w:rPr>
+      </w:pPr>
+    </w:p>
+    <w:p>
+      <w:pPr>
+        <w:spacing w:line="480" w:lineRule="auto"/>
+        <w:rPr>
+          <w:rFonts w:ascii="Times New Roman" w:hAnsi="Times New Roman" w:cs="Times New Roman"/>
+          <w:b/>
+          <w:bCs/>
+          <w:u w:val="single"/>
+          <w:lang w:val="es-MX"/>
+        </w:rPr>
+      </w:pPr>
+    </w:p>
+    <w:p>
+      <w:pPr>
+        <w:spacing w:line="480" w:lineRule="auto"/>
+        <w:rPr>
+          <w:rFonts w:ascii="Times New Roman" w:hAnsi="Times New Roman" w:cs="Times New Roman"/>
+          <w:b/>
+          <w:bCs/>
+          <w:u w:val="single"/>
+          <w:lang w:val="es-MX"/>
+        </w:rPr>
+      </w:pPr>
+    </w:p>
+    <w:p>
+      <w:pPr>
+        <w:spacing w:line="480" w:lineRule="auto"/>
+        <w:rPr>
+          <w:rFonts w:ascii="Times New Roman" w:hAnsi="Times New Roman" w:cs="Times New Roman"/>
+          <w:b/>
+          <w:bCs/>
+          <w:u w:val="single"/>
+          <w:lang w:val="es-MX"/>
+        </w:rPr>
+      </w:pPr>
+    </w:p>
+    <w:p>
+      <w:pPr>
+        <w:spacing w:line="480" w:lineRule="auto"/>
+        <w:rPr>
+          <w:rFonts w:ascii="Times New Roman" w:hAnsi="Times New Roman" w:cs="Times New Roman"/>
+          <w:b/>
+          <w:bCs/>
+          <w:u w:val="single"/>
+          <w:lang w:val="es-MX"/>
+        </w:rPr>
+      </w:pPr>
+    </w:p>
+    <w:p>
+      <w:pPr>
+        <w:spacing w:line="480" w:lineRule="auto"/>
+        <w:rPr>
+          <w:rFonts w:ascii="Times New Roman" w:hAnsi="Times New Roman" w:cs="Times New Roman"/>
+          <w:b/>
+          <w:bCs/>
+          <w:u w:val="single"/>
+          <w:lang w:val="es-MX"/>
+        </w:rPr>
+      </w:pPr>
+    </w:p>
+    <w:p>
+      <w:pPr>
+        <w:spacing w:line="480" w:lineRule="auto"/>
+        <w:rPr>
+          <w:rFonts w:ascii="Times New Roman" w:hAnsi="Times New Roman" w:cs="Times New Roman"/>
+          <w:b/>
+          <w:bCs/>
+          <w:u w:val="single"/>
+          <w:lang w:val="es-MX"/>
+        </w:rPr>
+      </w:pPr>
+    </w:p>
+    <w:p>
+      <w:pPr>
+        <w:spacing w:line="480" w:lineRule="auto"/>
+        <w:rPr>
+          <w:rFonts w:ascii="Times New Roman" w:hAnsi="Times New Roman" w:cs="Times New Roman"/>
+          <w:b/>
+          <w:bCs/>
+          <w:u w:val="single"/>
+          <w:lang w:val="es-MX"/>
+        </w:rPr>
+      </w:pPr>
+    </w:p>
+    <w:p>
+      <w:pPr>
+        <w:spacing w:line="480" w:lineRule="auto"/>
+        <w:rPr>
+          <w:rFonts w:ascii="Times New Roman" w:hAnsi="Times New Roman" w:cs="Times New Roman"/>
+          <w:b/>
+          <w:bCs/>
+          <w:u w:val="single"/>
+          <w:lang w:val="es-MX"/>
+        </w:rPr>
+      </w:pPr>
+    </w:p>
+    <w:p>
+      <w:pPr>
+        <w:spacing w:line="480" w:lineRule="auto"/>
+        <w:rPr>
+          <w:rFonts w:ascii="Times New Roman" w:hAnsi="Times New Roman" w:cs="Times New Roman"/>
+          <w:b/>
+          <w:bCs/>
+          <w:u w:val="single"/>
+          <w:lang w:val="es-MX"/>
+        </w:rPr>
+      </w:pPr>
+    </w:p>
+    <w:p>
+      <w:pPr>
+        <w:spacing w:line="480" w:lineRule="auto"/>
+        <w:rPr>
+          <w:rFonts w:ascii="Times New Roman" w:hAnsi="Times New Roman" w:cs="Times New Roman"/>
+          <w:b/>
+          <w:bCs/>
+          <w:u w:val="single"/>
+          <w:lang w:val="es-MX"/>
+        </w:rPr>
+      </w:pPr>
+    </w:p>
+    <w:p>
+      <w:pPr>
+        <w:spacing w:line="480" w:lineRule="auto"/>
+        <w:rPr>
+          <w:rFonts w:ascii="Times New Roman" w:hAnsi="Times New Roman" w:cs="Times New Roman"/>
+          <w:b/>
+          <w:bCs/>
+          <w:u w:val="single"/>
+          <w:lang w:val="es-MX"/>
+        </w:rPr>
+      </w:pPr>
+    </w:p>
+    <w:p>
+      <w:pPr>
+        <w:spacing w:line="480" w:lineRule="auto"/>
+        <w:rPr>
+          <w:rFonts w:ascii="Times New Roman" w:hAnsi="Times New Roman" w:cs="Times New Roman"/>
+          <w:b/>
+          <w:bCs/>
+          <w:lang w:val="es-MX"/>
+        </w:rPr>
+      </w:pPr>
+      <w:r>
+        <w:rPr>
+          <w:rFonts w:ascii="Times New Roman" w:hAnsi="Times New Roman" w:cs="Times New Roman"/>
+          <w:b/>
+          <w:bCs/>
+          <w:lang w:val="es-MX"/>
+        </w:rPr>
+        <w:lastRenderedPageBreak/>
+        <w:t>Objetivos</w:t>
+      </w:r>
+    </w:p>
+    <w:p>
+      <w:pPr>
+        <w:spacing w:line="480" w:lineRule="auto"/>
+        <w:rPr>
+          <w:rFonts w:ascii="Times New Roman" w:hAnsi="Times New Roman" w:cs="Times New Roman"/>
+        </w:rPr>
+      </w:pPr>
+      <w:r>
+        <w:rPr>
+          <w:rFonts w:ascii="Times New Roman" w:hAnsi="Times New Roman" w:cs="Times New Roman"/>
+          <w:b/>
+          <w:bCs/>
+          <w:lang w:val="es-MX"/>
+        </w:rPr>
+        <w:t xml:space="preserve">Objetivos generales: </w:t>
+      </w:r>
+      <w:r>
+        <w:rPr>
+          <w:rFonts w:ascii="Times New Roman" w:hAnsi="Times New Roman" w:cs="Times New Roman"/>
+        </w:rPr>
+        <w:t>Diseñar e implementar un e-</w:t>
       </w:r>
       <w:proofErr w:type="spellStart"/>
       <w:r>
         <w:rPr>
           <w:rFonts w:ascii="Times New Roman" w:hAnsi="Times New Roman" w:cs="Times New Roman"/>
-          <w:lang w:val="es-MX"/>
+        </w:rPr>
+        <w:t>commerce</w:t>
+      </w:r>
+      <w:proofErr w:type="spellEnd"/>
+      <w:r>
+        <w:rPr>
+          <w:rFonts w:ascii="Times New Roman" w:hAnsi="Times New Roman" w:cs="Times New Roman"/>
+        </w:rPr>
+        <w:t xml:space="preserve"> para la gestión de inventario y ventas en la tienda Calzado Cúcuta Store, Cúcuta – Norte de Santander, mediante el uso de </w:t>
+      </w:r>
+      <w:proofErr w:type="spellStart"/>
+      <w:r>
+        <w:rPr>
+          <w:rFonts w:ascii="Times New Roman" w:hAnsi="Times New Roman" w:cs="Times New Roman"/>
         </w:rPr>
         <w:t>React</w:t>
       </w:r>
@@ -599,13 +923,776 @@
       <w:r>
         <w:rPr>
           <w:rFonts w:ascii="Times New Roman" w:hAnsi="Times New Roman" w:cs="Times New Roman"/>
-          <w:lang w:val="es-MX"/>
-        </w:rPr>
-        <w:t xml:space="preserve"> con HTML, CSS y JSX, integre un sistema de inventario automatizado y múltiples opciones de pago, permitiendo así expandir la operación comercial a todo el territorio colombiano y posicionando a Calzado Cúcuta Store en el entorno digital nacional.</w:t>
+        </w:rPr>
+        <w:t xml:space="preserve"> con HTML, CSS y JSX, que integre un sistema automatizado de control de existencias y múltiples pasarelas de pago, con el fin de optimizar los procesos comerciales, ampliar el alcance de ventas a nivel nacional y mejorar la experiencia de compra de los clientes.</w:t>
+      </w:r>
+    </w:p>
+    <w:p>
+      <w:pPr>
+        <w:spacing w:line="480" w:lineRule="auto"/>
+        <w:rPr>
+          <w:rFonts w:ascii="Times New Roman" w:hAnsi="Times New Roman" w:cs="Times New Roman"/>
+        </w:rPr>
+      </w:pPr>
+    </w:p>
+    <w:p>
+      <w:pPr>
+        <w:spacing w:line="480" w:lineRule="auto"/>
+        <w:rPr>
+          <w:rFonts w:ascii="Times New Roman" w:hAnsi="Times New Roman" w:cs="Times New Roman"/>
+          <w:b/>
+          <w:bCs/>
+        </w:rPr>
+      </w:pPr>
+      <w:r>
+        <w:rPr>
+          <w:rFonts w:ascii="Times New Roman" w:hAnsi="Times New Roman" w:cs="Times New Roman"/>
+          <w:b/>
+          <w:bCs/>
+        </w:rPr>
+        <w:t>Objetivos específicos:</w:t>
+      </w:r>
+    </w:p>
+    <w:p>
+      <w:pPr>
+        <w:pStyle w:val="Prrafodelista"/>
+        <w:numPr>
+          <w:ilvl w:val="0"/>
+          <w:numId w:val="1"/>
+        </w:numPr>
+        <w:spacing w:line="480" w:lineRule="auto"/>
+        <w:rPr>
+          <w:rFonts w:ascii="Times New Roman" w:hAnsi="Times New Roman" w:cs="Times New Roman"/>
+          <w:b/>
+          <w:bCs/>
+          <w:lang w:val="es-MX"/>
+        </w:rPr>
+      </w:pPr>
+      <w:r>
+        <w:rPr>
+          <w:rFonts w:ascii="Times New Roman" w:hAnsi="Times New Roman" w:cs="Times New Roman"/>
+        </w:rPr>
+        <w:t>Analizar los requerimientos funcionales y no funcionales del e-</w:t>
+      </w:r>
+      <w:proofErr w:type="spellStart"/>
+      <w:r>
+        <w:rPr>
+          <w:rFonts w:ascii="Times New Roman" w:hAnsi="Times New Roman" w:cs="Times New Roman"/>
+        </w:rPr>
+        <w:t>commerce</w:t>
+      </w:r>
+      <w:proofErr w:type="spellEnd"/>
+      <w:r>
+        <w:rPr>
+          <w:rFonts w:ascii="Times New Roman" w:hAnsi="Times New Roman" w:cs="Times New Roman"/>
+        </w:rPr>
+        <w:t xml:space="preserve"> para la tienda Calzado Cúcuta Store, mediante la identificación de las necesidades del negocio y del usuario final, con el fin de establecer las bases del diseño y desarrollo del sistema.</w:t>
+      </w:r>
+    </w:p>
+    <w:p>
+      <w:pPr>
+        <w:pStyle w:val="Prrafodelista"/>
+        <w:numPr>
+          <w:ilvl w:val="0"/>
+          <w:numId w:val="1"/>
+        </w:numPr>
+        <w:spacing w:line="480" w:lineRule="auto"/>
+        <w:rPr>
+          <w:rFonts w:ascii="Times New Roman" w:hAnsi="Times New Roman" w:cs="Times New Roman"/>
+          <w:lang w:val="es-MX"/>
+        </w:rPr>
+      </w:pPr>
+      <w:r>
+        <w:rPr>
+          <w:rFonts w:ascii="Times New Roman" w:hAnsi="Times New Roman" w:cs="Times New Roman"/>
+        </w:rPr>
+        <w:t>Diseñar la arquitectura y la interfaz de usuario del e-</w:t>
+      </w:r>
+      <w:proofErr w:type="spellStart"/>
+      <w:r>
+        <w:rPr>
+          <w:rFonts w:ascii="Times New Roman" w:hAnsi="Times New Roman" w:cs="Times New Roman"/>
+        </w:rPr>
+        <w:t>commerce</w:t>
+      </w:r>
+      <w:proofErr w:type="spellEnd"/>
+      <w:r>
+        <w:rPr>
+          <w:rFonts w:ascii="Times New Roman" w:hAnsi="Times New Roman" w:cs="Times New Roman"/>
+        </w:rPr>
+        <w:t xml:space="preserve">, utilizando </w:t>
+      </w:r>
+      <w:proofErr w:type="spellStart"/>
+      <w:r>
+        <w:rPr>
+          <w:rFonts w:ascii="Times New Roman" w:hAnsi="Times New Roman" w:cs="Times New Roman"/>
+        </w:rPr>
+        <w:t>React</w:t>
+      </w:r>
+      <w:proofErr w:type="spellEnd"/>
+      <w:r>
+        <w:rPr>
+          <w:rFonts w:ascii="Times New Roman" w:hAnsi="Times New Roman" w:cs="Times New Roman"/>
+        </w:rPr>
+        <w:t xml:space="preserve"> con HTML, CSS y JSX, mediante la elaboración de </w:t>
+      </w:r>
+      <w:proofErr w:type="spellStart"/>
+      <w:r>
+        <w:rPr>
+          <w:rFonts w:ascii="Times New Roman" w:hAnsi="Times New Roman" w:cs="Times New Roman"/>
+        </w:rPr>
+        <w:t>wireframes</w:t>
+      </w:r>
+      <w:proofErr w:type="spellEnd"/>
+      <w:r>
+        <w:rPr>
+          <w:rFonts w:ascii="Times New Roman" w:hAnsi="Times New Roman" w:cs="Times New Roman"/>
+        </w:rPr>
+        <w:t>, prototipos y diagramas de componentes, con el fin de garantizar una experiencia de compra intuitiva, atractiva y responsiva.</w:t>
+      </w:r>
+    </w:p>
+    <w:p>
+      <w:pPr>
+        <w:pStyle w:val="Prrafodelista"/>
+        <w:numPr>
+          <w:ilvl w:val="0"/>
+          <w:numId w:val="1"/>
+        </w:numPr>
+        <w:spacing w:line="480" w:lineRule="auto"/>
+        <w:rPr>
+          <w:rFonts w:ascii="Times New Roman" w:hAnsi="Times New Roman" w:cs="Times New Roman"/>
+          <w:lang w:val="es-MX"/>
+        </w:rPr>
+      </w:pPr>
+      <w:r>
+        <w:rPr>
+          <w:rFonts w:ascii="Times New Roman" w:hAnsi="Times New Roman" w:cs="Times New Roman"/>
+          <w:lang w:val="es-MX"/>
+        </w:rPr>
+        <w:t>Implementar el módulo de gestión de inventario en la plataforma, mediante la programación de funciones que actualicen automáticamente las existencias en tiempo real, con el fin de evitar errores de stock, desabastecimiento y acumulación de productos no vendidos.</w:t>
+      </w:r>
+    </w:p>
+    <w:p>
+      <w:pPr>
+        <w:pStyle w:val="Prrafodelista"/>
+        <w:numPr>
+          <w:ilvl w:val="0"/>
+          <w:numId w:val="1"/>
+        </w:numPr>
+        <w:spacing w:line="480" w:lineRule="auto"/>
+        <w:rPr>
+          <w:rFonts w:ascii="Times New Roman" w:hAnsi="Times New Roman" w:cs="Times New Roman"/>
+          <w:lang w:val="es-MX"/>
+        </w:rPr>
+      </w:pPr>
+      <w:r>
+        <w:rPr>
+          <w:rFonts w:ascii="Times New Roman" w:hAnsi="Times New Roman" w:cs="Times New Roman"/>
+          <w:lang w:val="es-MX"/>
+        </w:rPr>
+        <w:t xml:space="preserve">Integrar al menos dos pasarelas de pago que operen en el contexto colombiano, mediante la conexión de </w:t>
+      </w:r>
+      <w:proofErr w:type="spellStart"/>
+      <w:r>
+        <w:rPr>
+          <w:rFonts w:ascii="Times New Roman" w:hAnsi="Times New Roman" w:cs="Times New Roman"/>
+          <w:lang w:val="es-MX"/>
+        </w:rPr>
+        <w:t>APIs</w:t>
+      </w:r>
+      <w:proofErr w:type="spellEnd"/>
+      <w:r>
+        <w:rPr>
+          <w:rFonts w:ascii="Times New Roman" w:hAnsi="Times New Roman" w:cs="Times New Roman"/>
+          <w:lang w:val="es-MX"/>
+        </w:rPr>
+        <w:t xml:space="preserve"> de servicios como </w:t>
+      </w:r>
+      <w:proofErr w:type="spellStart"/>
+      <w:r>
+        <w:rPr>
+          <w:rFonts w:ascii="Times New Roman" w:hAnsi="Times New Roman" w:cs="Times New Roman"/>
+          <w:lang w:val="es-MX"/>
+        </w:rPr>
+        <w:t>Wompi</w:t>
+      </w:r>
+      <w:proofErr w:type="spellEnd"/>
+      <w:r>
+        <w:rPr>
+          <w:rFonts w:ascii="Times New Roman" w:hAnsi="Times New Roman" w:cs="Times New Roman"/>
+          <w:lang w:val="es-MX"/>
+        </w:rPr>
+        <w:t xml:space="preserve">, </w:t>
+      </w:r>
+      <w:proofErr w:type="spellStart"/>
+      <w:r>
+        <w:rPr>
+          <w:rFonts w:ascii="Times New Roman" w:hAnsi="Times New Roman" w:cs="Times New Roman"/>
+          <w:lang w:val="es-MX"/>
+        </w:rPr>
+        <w:t>MercadoPago</w:t>
+      </w:r>
+      <w:proofErr w:type="spellEnd"/>
+      <w:r>
+        <w:rPr>
+          <w:rFonts w:ascii="Times New Roman" w:hAnsi="Times New Roman" w:cs="Times New Roman"/>
+          <w:lang w:val="es-MX"/>
+        </w:rPr>
+        <w:t xml:space="preserve"> o </w:t>
+      </w:r>
+      <w:proofErr w:type="spellStart"/>
+      <w:r>
+        <w:rPr>
+          <w:rFonts w:ascii="Times New Roman" w:hAnsi="Times New Roman" w:cs="Times New Roman"/>
+          <w:lang w:val="es-MX"/>
+        </w:rPr>
+        <w:t>Epayco</w:t>
+      </w:r>
+      <w:proofErr w:type="spellEnd"/>
+      <w:r>
+        <w:rPr>
+          <w:rFonts w:ascii="Times New Roman" w:hAnsi="Times New Roman" w:cs="Times New Roman"/>
+          <w:lang w:val="es-MX"/>
+        </w:rPr>
+        <w:t>, con el fin de ofrecer transacciones seguras, ágiles y flexibles a los clientes a nivel nacional.</w:t>
+      </w:r>
+    </w:p>
+    <w:p>
+      <w:pPr>
+        <w:pStyle w:val="Prrafodelista"/>
+        <w:numPr>
+          <w:ilvl w:val="0"/>
+          <w:numId w:val="1"/>
+        </w:numPr>
+        <w:spacing w:line="480" w:lineRule="auto"/>
+        <w:rPr>
+          <w:rFonts w:ascii="Times New Roman" w:hAnsi="Times New Roman" w:cs="Times New Roman"/>
+          <w:lang w:val="es-MX"/>
+        </w:rPr>
+      </w:pPr>
+      <w:r>
+        <w:rPr>
+          <w:rFonts w:ascii="Times New Roman" w:hAnsi="Times New Roman" w:cs="Times New Roman"/>
+          <w:lang w:val="es-MX"/>
+        </w:rPr>
+        <w:lastRenderedPageBreak/>
+        <w:t>Evaluar el funcionamiento del e-</w:t>
+      </w:r>
+      <w:proofErr w:type="spellStart"/>
+      <w:r>
+        <w:rPr>
+          <w:rFonts w:ascii="Times New Roman" w:hAnsi="Times New Roman" w:cs="Times New Roman"/>
+          <w:lang w:val="es-MX"/>
+        </w:rPr>
+        <w:t>commerce</w:t>
+      </w:r>
+      <w:proofErr w:type="spellEnd"/>
+      <w:r>
+        <w:rPr>
+          <w:rFonts w:ascii="Times New Roman" w:hAnsi="Times New Roman" w:cs="Times New Roman"/>
+          <w:lang w:val="es-MX"/>
+        </w:rPr>
+        <w:t>, mediante la ejecución de pruebas de usabilidad, rendimiento y seguridad, con el fin de validar el cumplimiento de los requerimientos y garantizar la calidad del sistema antes de su despliegue.</w:t>
+      </w:r>
+    </w:p>
+    <w:p>
+      <w:pPr>
+        <w:pStyle w:val="Prrafodelista"/>
+        <w:numPr>
+          <w:ilvl w:val="0"/>
+          <w:numId w:val="1"/>
+        </w:numPr>
+        <w:rPr>
+          <w:rFonts w:ascii="Times New Roman" w:hAnsi="Times New Roman" w:cs="Times New Roman"/>
+          <w:lang w:val="es-MX"/>
+        </w:rPr>
+      </w:pPr>
+      <w:r>
+        <w:rPr>
+          <w:rFonts w:ascii="Times New Roman" w:hAnsi="Times New Roman" w:cs="Times New Roman"/>
+          <w:lang w:val="es-MX"/>
+        </w:rPr>
+        <w:t>Desplegar la plataforma e-</w:t>
+      </w:r>
+      <w:proofErr w:type="spellStart"/>
+      <w:r>
+        <w:rPr>
+          <w:rFonts w:ascii="Times New Roman" w:hAnsi="Times New Roman" w:cs="Times New Roman"/>
+          <w:lang w:val="es-MX"/>
+        </w:rPr>
+        <w:t>commerce</w:t>
+      </w:r>
+      <w:proofErr w:type="spellEnd"/>
+      <w:r>
+        <w:rPr>
+          <w:rFonts w:ascii="Times New Roman" w:hAnsi="Times New Roman" w:cs="Times New Roman"/>
+          <w:lang w:val="es-MX"/>
+        </w:rPr>
+        <w:t xml:space="preserve"> en un entorno de producción, mediante la configuración de hosting, dominio y servicios complementarios, con el fin de poner el sistema a disposición de los clientes a nivel nacional y dar inicio a la operación digital de Calzado Cúcuta Store.</w:t>
+      </w:r>
+    </w:p>
+    <w:p>
+      <w:pPr>
+        <w:rPr>
+          <w:rFonts w:ascii="Times New Roman" w:hAnsi="Times New Roman" w:cs="Times New Roman"/>
+          <w:lang w:val="es-MX"/>
+        </w:rPr>
+      </w:pPr>
+    </w:p>
+    <w:p>
+      <w:pPr>
+        <w:rPr>
+          <w:rFonts w:ascii="Times New Roman" w:hAnsi="Times New Roman" w:cs="Times New Roman"/>
+          <w:lang w:val="es-MX"/>
+        </w:rPr>
+      </w:pPr>
+    </w:p>
+    <w:p>
+      <w:pPr>
+        <w:rPr>
+          <w:rFonts w:ascii="Times New Roman" w:hAnsi="Times New Roman" w:cs="Times New Roman"/>
+          <w:lang w:val="es-MX"/>
+        </w:rPr>
+      </w:pPr>
+    </w:p>
+    <w:p>
+      <w:pPr>
+        <w:rPr>
+          <w:rFonts w:ascii="Times New Roman" w:hAnsi="Times New Roman" w:cs="Times New Roman"/>
+          <w:lang w:val="es-MX"/>
+        </w:rPr>
+      </w:pPr>
+    </w:p>
+    <w:p>
+      <w:pPr>
+        <w:rPr>
+          <w:rFonts w:ascii="Times New Roman" w:hAnsi="Times New Roman" w:cs="Times New Roman"/>
+          <w:lang w:val="es-MX"/>
+        </w:rPr>
+      </w:pPr>
+    </w:p>
+    <w:p>
+      <w:pPr>
+        <w:rPr>
+          <w:rFonts w:ascii="Times New Roman" w:hAnsi="Times New Roman" w:cs="Times New Roman"/>
+          <w:lang w:val="es-MX"/>
+        </w:rPr>
+      </w:pPr>
+    </w:p>
+    <w:p>
+      <w:pPr>
+        <w:rPr>
+          <w:rFonts w:ascii="Times New Roman" w:hAnsi="Times New Roman" w:cs="Times New Roman"/>
+          <w:lang w:val="es-MX"/>
+        </w:rPr>
+      </w:pPr>
+    </w:p>
+    <w:p>
+      <w:pPr>
+        <w:rPr>
+          <w:rFonts w:ascii="Times New Roman" w:hAnsi="Times New Roman" w:cs="Times New Roman"/>
+          <w:lang w:val="es-MX"/>
+        </w:rPr>
+      </w:pPr>
+    </w:p>
+    <w:p>
+      <w:pPr>
+        <w:rPr>
+          <w:rFonts w:ascii="Times New Roman" w:hAnsi="Times New Roman" w:cs="Times New Roman"/>
+          <w:lang w:val="es-MX"/>
+        </w:rPr>
+      </w:pPr>
+    </w:p>
+    <w:p>
+      <w:pPr>
+        <w:rPr>
+          <w:rFonts w:ascii="Times New Roman" w:hAnsi="Times New Roman" w:cs="Times New Roman"/>
+          <w:lang w:val="es-MX"/>
+        </w:rPr>
+      </w:pPr>
+    </w:p>
+    <w:p>
+      <w:pPr>
+        <w:rPr>
+          <w:rFonts w:ascii="Times New Roman" w:hAnsi="Times New Roman" w:cs="Times New Roman"/>
+          <w:lang w:val="es-MX"/>
+        </w:rPr>
+      </w:pPr>
+    </w:p>
+    <w:p>
+      <w:pPr>
+        <w:rPr>
+          <w:rFonts w:ascii="Times New Roman" w:hAnsi="Times New Roman" w:cs="Times New Roman"/>
+          <w:lang w:val="es-MX"/>
+        </w:rPr>
+      </w:pPr>
+    </w:p>
+    <w:p>
+      <w:pPr>
+        <w:rPr>
+          <w:rFonts w:ascii="Times New Roman" w:hAnsi="Times New Roman" w:cs="Times New Roman"/>
+          <w:lang w:val="es-MX"/>
+        </w:rPr>
+      </w:pPr>
+    </w:p>
+    <w:p>
+      <w:pPr>
+        <w:rPr>
+          <w:rFonts w:ascii="Times New Roman" w:hAnsi="Times New Roman" w:cs="Times New Roman"/>
+          <w:lang w:val="es-MX"/>
+        </w:rPr>
+      </w:pPr>
+    </w:p>
+    <w:p>
+      <w:pPr>
+        <w:rPr>
+          <w:rFonts w:ascii="Times New Roman" w:hAnsi="Times New Roman" w:cs="Times New Roman"/>
+          <w:lang w:val="es-MX"/>
+        </w:rPr>
+      </w:pPr>
+    </w:p>
+    <w:p>
+      <w:pPr>
+        <w:rPr>
+          <w:rFonts w:ascii="Times New Roman" w:hAnsi="Times New Roman" w:cs="Times New Roman"/>
+          <w:lang w:val="es-MX"/>
+        </w:rPr>
+      </w:pPr>
+    </w:p>
+    <w:p>
+      <w:pPr>
+        <w:rPr>
+          <w:rFonts w:ascii="Times New Roman" w:hAnsi="Times New Roman" w:cs="Times New Roman"/>
+          <w:lang w:val="es-MX"/>
+        </w:rPr>
+      </w:pPr>
+    </w:p>
+    <w:p>
+      <w:pPr>
+        <w:rPr>
+          <w:rFonts w:ascii="Times New Roman" w:hAnsi="Times New Roman" w:cs="Times New Roman"/>
+          <w:lang w:val="es-MX"/>
+        </w:rPr>
+      </w:pPr>
+    </w:p>
+    <w:p>
+      <w:pPr>
+        <w:rPr>
+          <w:rFonts w:ascii="Times New Roman" w:hAnsi="Times New Roman" w:cs="Times New Roman"/>
+          <w:lang w:val="es-MX"/>
+        </w:rPr>
+      </w:pPr>
+    </w:p>
+    <w:p>
+      <w:pPr>
+        <w:rPr>
+          <w:rFonts w:ascii="Times New Roman" w:hAnsi="Times New Roman" w:cs="Times New Roman"/>
+          <w:lang w:val="es-MX"/>
+        </w:rPr>
+      </w:pPr>
+    </w:p>
+    <w:p>
+      <w:pPr>
+        <w:rPr>
+          <w:rFonts w:ascii="Times New Roman" w:hAnsi="Times New Roman" w:cs="Times New Roman"/>
+          <w:b/>
+          <w:bCs/>
+          <w:lang w:val="es-MX"/>
+        </w:rPr>
+      </w:pPr>
+      <w:r>
+        <w:rPr>
+          <w:rFonts w:ascii="Times New Roman" w:hAnsi="Times New Roman" w:cs="Times New Roman"/>
+          <w:b/>
+          <w:bCs/>
+          <w:lang w:val="es-MX"/>
+        </w:rPr>
+        <w:lastRenderedPageBreak/>
+        <w:t>Marco Teórico</w:t>
+      </w:r>
+    </w:p>
+    <w:p>
+      <w:pPr>
+        <w:rPr>
+          <w:rFonts w:ascii="Times New Roman" w:hAnsi="Times New Roman" w:cs="Times New Roman"/>
+          <w:b/>
+          <w:bCs/>
+          <w:lang w:val="es-MX"/>
+        </w:rPr>
+      </w:pPr>
+    </w:p>
+    <w:p>
+      <w:pPr>
+        <w:rPr>
+          <w:rFonts w:ascii="Times New Roman" w:hAnsi="Times New Roman" w:cs="Times New Roman"/>
+          <w:b/>
+          <w:bCs/>
+          <w:lang w:val="es-MX"/>
+        </w:rPr>
+      </w:pPr>
+    </w:p>
+    <w:p>
+      <w:pPr>
+        <w:rPr>
+          <w:rFonts w:ascii="Times New Roman" w:hAnsi="Times New Roman" w:cs="Times New Roman"/>
+          <w:b/>
+          <w:bCs/>
+          <w:lang w:val="es-MX"/>
+        </w:rPr>
+      </w:pPr>
+    </w:p>
+    <w:p>
+      <w:pPr>
+        <w:rPr>
+          <w:rFonts w:ascii="Times New Roman" w:hAnsi="Times New Roman" w:cs="Times New Roman"/>
+          <w:b/>
+          <w:bCs/>
+          <w:lang w:val="es-MX"/>
+        </w:rPr>
+      </w:pPr>
+    </w:p>
+    <w:p>
+      <w:pPr>
+        <w:rPr>
+          <w:rFonts w:ascii="Times New Roman" w:hAnsi="Times New Roman" w:cs="Times New Roman"/>
+          <w:b/>
+          <w:bCs/>
+          <w:lang w:val="es-MX"/>
+        </w:rPr>
+      </w:pPr>
+    </w:p>
+    <w:p>
+      <w:pPr>
+        <w:rPr>
+          <w:rFonts w:ascii="Times New Roman" w:hAnsi="Times New Roman" w:cs="Times New Roman"/>
+          <w:b/>
+          <w:bCs/>
+          <w:lang w:val="es-MX"/>
+        </w:rPr>
+      </w:pPr>
+    </w:p>
+    <w:p>
+      <w:pPr>
+        <w:rPr>
+          <w:rFonts w:ascii="Times New Roman" w:hAnsi="Times New Roman" w:cs="Times New Roman"/>
+          <w:b/>
+          <w:bCs/>
+          <w:lang w:val="es-MX"/>
+        </w:rPr>
+      </w:pPr>
+    </w:p>
+    <w:p>
+      <w:pPr>
+        <w:rPr>
+          <w:rFonts w:ascii="Times New Roman" w:hAnsi="Times New Roman" w:cs="Times New Roman"/>
+          <w:b/>
+          <w:bCs/>
+          <w:lang w:val="es-MX"/>
+        </w:rPr>
+      </w:pPr>
+    </w:p>
+    <w:p>
+      <w:pPr>
+        <w:rPr>
+          <w:rFonts w:ascii="Times New Roman" w:hAnsi="Times New Roman" w:cs="Times New Roman"/>
+          <w:b/>
+          <w:bCs/>
+          <w:lang w:val="es-MX"/>
+        </w:rPr>
+      </w:pPr>
+    </w:p>
+    <w:p>
+      <w:pPr>
+        <w:rPr>
+          <w:rFonts w:ascii="Times New Roman" w:hAnsi="Times New Roman" w:cs="Times New Roman"/>
+          <w:b/>
+          <w:bCs/>
+          <w:lang w:val="es-MX"/>
+        </w:rPr>
+      </w:pPr>
+    </w:p>
+    <w:p>
+      <w:pPr>
+        <w:rPr>
+          <w:rFonts w:ascii="Times New Roman" w:hAnsi="Times New Roman" w:cs="Times New Roman"/>
+          <w:b/>
+          <w:bCs/>
+          <w:lang w:val="es-MX"/>
+        </w:rPr>
+      </w:pPr>
+    </w:p>
+    <w:p>
+      <w:pPr>
+        <w:rPr>
+          <w:rFonts w:ascii="Times New Roman" w:hAnsi="Times New Roman" w:cs="Times New Roman"/>
+          <w:b/>
+          <w:bCs/>
+          <w:lang w:val="es-MX"/>
+        </w:rPr>
+      </w:pPr>
+    </w:p>
+    <w:p>
+      <w:pPr>
+        <w:rPr>
+          <w:rFonts w:ascii="Times New Roman" w:hAnsi="Times New Roman" w:cs="Times New Roman"/>
+          <w:b/>
+          <w:bCs/>
+          <w:lang w:val="es-MX"/>
+        </w:rPr>
+      </w:pPr>
+    </w:p>
+    <w:p>
+      <w:pPr>
+        <w:rPr>
+          <w:rFonts w:ascii="Times New Roman" w:hAnsi="Times New Roman" w:cs="Times New Roman"/>
+          <w:b/>
+          <w:bCs/>
+          <w:lang w:val="es-MX"/>
+        </w:rPr>
+      </w:pPr>
+    </w:p>
+    <w:p>
+      <w:pPr>
+        <w:rPr>
+          <w:rFonts w:ascii="Times New Roman" w:hAnsi="Times New Roman" w:cs="Times New Roman"/>
+          <w:b/>
+          <w:bCs/>
+          <w:lang w:val="es-MX"/>
+        </w:rPr>
+      </w:pPr>
+    </w:p>
+    <w:p>
+      <w:pPr>
+        <w:rPr>
+          <w:rFonts w:ascii="Times New Roman" w:hAnsi="Times New Roman" w:cs="Times New Roman"/>
+          <w:b/>
+          <w:bCs/>
+          <w:lang w:val="es-MX"/>
+        </w:rPr>
+      </w:pPr>
+    </w:p>
+    <w:p>
+      <w:pPr>
+        <w:rPr>
+          <w:rFonts w:ascii="Times New Roman" w:hAnsi="Times New Roman" w:cs="Times New Roman"/>
+          <w:b/>
+          <w:bCs/>
+          <w:lang w:val="es-MX"/>
+        </w:rPr>
+      </w:pPr>
+    </w:p>
+    <w:p>
+      <w:pPr>
+        <w:rPr>
+          <w:rFonts w:ascii="Times New Roman" w:hAnsi="Times New Roman" w:cs="Times New Roman"/>
+          <w:b/>
+          <w:bCs/>
+          <w:lang w:val="es-MX"/>
+        </w:rPr>
+      </w:pPr>
+    </w:p>
+    <w:p>
+      <w:pPr>
+        <w:rPr>
+          <w:rFonts w:ascii="Times New Roman" w:hAnsi="Times New Roman" w:cs="Times New Roman"/>
+          <w:b/>
+          <w:bCs/>
+          <w:lang w:val="es-MX"/>
+        </w:rPr>
+      </w:pPr>
+    </w:p>
+    <w:p>
+      <w:pPr>
+        <w:rPr>
+          <w:rFonts w:ascii="Times New Roman" w:hAnsi="Times New Roman" w:cs="Times New Roman"/>
+          <w:b/>
+          <w:bCs/>
+          <w:lang w:val="es-MX"/>
+        </w:rPr>
+      </w:pPr>
+    </w:p>
+    <w:p>
+      <w:pPr>
+        <w:rPr>
+          <w:rFonts w:ascii="Times New Roman" w:hAnsi="Times New Roman" w:cs="Times New Roman"/>
+          <w:b/>
+          <w:bCs/>
+          <w:lang w:val="es-MX"/>
+        </w:rPr>
+      </w:pPr>
+    </w:p>
+    <w:p>
+      <w:pPr>
+        <w:rPr>
+          <w:rFonts w:ascii="Times New Roman" w:hAnsi="Times New Roman" w:cs="Times New Roman"/>
+          <w:b/>
+          <w:bCs/>
+          <w:lang w:val="es-MX"/>
+        </w:rPr>
+      </w:pPr>
+    </w:p>
+    <w:p>
+      <w:pPr>
+        <w:rPr>
+          <w:rFonts w:ascii="Times New Roman" w:hAnsi="Times New Roman" w:cs="Times New Roman"/>
+          <w:b/>
+          <w:bCs/>
+          <w:lang w:val="es-MX"/>
+        </w:rPr>
+      </w:pPr>
+    </w:p>
+    <w:p>
+      <w:pPr>
+        <w:rPr>
+          <w:rFonts w:ascii="Times New Roman" w:hAnsi="Times New Roman" w:cs="Times New Roman"/>
+          <w:b/>
+          <w:bCs/>
+          <w:lang w:val="es-MX"/>
+        </w:rPr>
+      </w:pPr>
+    </w:p>
+    <w:p>
+      <w:pPr>
+        <w:rPr>
+          <w:rFonts w:ascii="Times New Roman" w:hAnsi="Times New Roman" w:cs="Times New Roman"/>
+          <w:b/>
+          <w:bCs/>
+          <w:lang w:val="es-MX"/>
+        </w:rPr>
+      </w:pPr>
+    </w:p>
+    <w:p>
+      <w:pPr>
+        <w:rPr>
+          <w:rFonts w:ascii="Times New Roman" w:hAnsi="Times New Roman" w:cs="Times New Roman"/>
+          <w:b/>
+          <w:bCs/>
+          <w:lang w:val="es-MX"/>
+        </w:rPr>
+      </w:pPr>
+    </w:p>
+    <w:p>
+      <w:pPr>
+        <w:rPr>
+          <w:rFonts w:ascii="Times New Roman" w:hAnsi="Times New Roman" w:cs="Times New Roman"/>
+          <w:b/>
+          <w:bCs/>
+          <w:lang w:val="es-MX"/>
+        </w:rPr>
+      </w:pPr>
+      <w:r>
+        <w:rPr>
+          <w:rFonts w:ascii="Times New Roman" w:hAnsi="Times New Roman" w:cs="Times New Roman"/>
+          <w:b/>
+          <w:bCs/>
+          <w:lang w:val="es-MX"/>
+        </w:rPr>
+        <w:lastRenderedPageBreak/>
+        <w:t xml:space="preserve">Metodología </w:t>
       </w:r>
     </w:p>
     <w:sectPr>
-      <w:headerReference w:type="default" r:id="rId6"/>
+      <w:headerReference w:type="default" r:id="rId8"/>
       <w:pgSz w:w="12240" w:h="15840" w:code="1"/>
       <w:pgMar w:top="1440" w:right="1440" w:bottom="1440" w:left="1440" w:header="709" w:footer="709" w:gutter="0"/>
       <w:cols w:space="708"/>
@@ -708,6 +1795,127 @@
     </w:pPr>
   </w:p>
 </w:hdr>
+</file>
+
+<file path=word/numbering.xml><?xml version="1.0" encoding="utf-8"?>
+<w:numbering xmlns:wpc="http://schemas.microsoft.com/office/word/2010/wordprocessingCanvas" xmlns:cx="http://schemas.microsoft.com/office/drawing/2014/chartex" xmlns:cx1="http://schemas.microsoft.com/office/drawing/2015/9/8/chartex" xmlns:cx2="http://schemas.microsoft.com/office/drawing/2015/10/21/chartex" xmlns:cx3="http://schemas.microsoft.com/office/drawing/2016/5/9/chartex" xmlns:cx4="http://schemas.microsoft.com/office/drawing/2016/5/10/chartex" xmlns:cx5="http://schemas.microsoft.com/office/drawing/2016/5/11/chartex" xmlns:cx6="http://schemas.microsoft.com/office/drawing/2016/5/12/chartex" xmlns:cx7="http://schemas.microsoft.com/office/drawing/2016/5/13/chartex" xmlns:cx8="http://schemas.microsoft.com/office/drawing/2016/5/14/chartex" xmlns:mc="http://schemas.openxmlformats.org/markup-compatibility/2006" xmlns:aink="http://schemas.microsoft.com/office/drawing/2016/ink" xmlns:am3d="http://schemas.microsoft.com/office/drawing/2017/model3d" xmlns:o="urn:schemas-microsoft-com:office:office" xmlns:oel="http://schemas.microsoft.com/office/2019/extlst" xmlns:r="http://schemas.openxmlformats.org/officeDocument/2006/relationships" xmlns:m="http://schemas.openxmlformats.org/officeDocument/2006/math" xmlns:v="urn:schemas-microsoft-com:vml" xmlns:wp14="http://schemas.microsoft.com/office/word/2010/wordprocessingDrawing" xmlns:wp="http://schemas.openxmlformats.org/drawingml/2006/wordprocessingDrawing" xmlns:w10="urn:schemas-microsoft-com:office:word" xmlns:w="http://schemas.openxmlformats.org/wordprocessingml/2006/main" xmlns:w14="http://schemas.microsoft.com/office/word/2010/wordml" xmlns:w15="http://schemas.microsoft.com/office/word/2012/wordml" xmlns:w16cex="http://schemas.microsoft.com/office/word/2018/wordml/cex" xmlns:w16cid="http://schemas.microsoft.com/office/word/2016/wordml/cid" xmlns:w16="http://schemas.microsoft.com/office/word/2018/wordml" xmlns:w16du="http://schemas.microsoft.com/office/word/2023/wordml/word16du" xmlns:w16sdtdh="http://schemas.microsoft.com/office/word/2020/wordml/sdtdatahash" xmlns:w16sdtfl="http://schemas.microsoft.com/office/word/2024/wordml/sdtformatlock" xmlns:w16se="http://schemas.microsoft.com/office/word/2015/wordml/symex" xmlns:wpg="http://schemas.microsoft.com/office/word/2010/wordprocessingGroup" xmlns:wpi="http://schemas.microsoft.com/office/word/2010/wordprocessingInk" xmlns:wne="http://schemas.microsoft.com/office/word/2006/wordml" xmlns:wps="http://schemas.microsoft.com/office/word/2010/wordprocessingShape" mc:Ignorable="w14 w15 w16se w16cid w16 w16cex w16sdtdh w16sdtfl w16du wp14">
+  <w:abstractNum w:abstractNumId="0" w15:restartNumberingAfterBreak="0">
+    <w:nsid w:val="005D17AB"/>
+    <w:multiLevelType w:val="hybridMultilevel"/>
+    <w:tmpl w:val="4EE4D8C2"/>
+    <w:lvl w:ilvl="0" w:tplc="240A0001">
+      <w:start w:val="1"/>
+      <w:numFmt w:val="bullet"/>
+      <w:lvlText w:val=""/>
+      <w:lvlJc w:val="left"/>
+      <w:pPr>
+        <w:ind w:left="720" w:hanging="360"/>
+      </w:pPr>
+      <w:rPr>
+        <w:rFonts w:ascii="Symbol" w:hAnsi="Symbol" w:hint="default"/>
+      </w:rPr>
+    </w:lvl>
+    <w:lvl w:ilvl="1" w:tplc="240A0003" w:tentative="1">
+      <w:start w:val="1"/>
+      <w:numFmt w:val="bullet"/>
+      <w:lvlText w:val="o"/>
+      <w:lvlJc w:val="left"/>
+      <w:pPr>
+        <w:ind w:left="1440" w:hanging="360"/>
+      </w:pPr>
+      <w:rPr>
+        <w:rFonts w:ascii="Courier New" w:hAnsi="Courier New" w:cs="Courier New" w:hint="default"/>
+      </w:rPr>
+    </w:lvl>
+    <w:lvl w:ilvl="2" w:tplc="240A0005" w:tentative="1">
+      <w:start w:val="1"/>
+      <w:numFmt w:val="bullet"/>
+      <w:lvlText w:val=""/>
+      <w:lvlJc w:val="left"/>
+      <w:pPr>
+        <w:ind w:left="2160" w:hanging="360"/>
+      </w:pPr>
+      <w:rPr>
+        <w:rFonts w:ascii="Wingdings" w:hAnsi="Wingdings" w:hint="default"/>
+      </w:rPr>
+    </w:lvl>
+    <w:lvl w:ilvl="3" w:tplc="240A0001" w:tentative="1">
+      <w:start w:val="1"/>
+      <w:numFmt w:val="bullet"/>
+      <w:lvlText w:val=""/>
+      <w:lvlJc w:val="left"/>
+      <w:pPr>
+        <w:ind w:left="2880" w:hanging="360"/>
+      </w:pPr>
+      <w:rPr>
+        <w:rFonts w:ascii="Symbol" w:hAnsi="Symbol" w:hint="default"/>
+      </w:rPr>
+    </w:lvl>
+    <w:lvl w:ilvl="4" w:tplc="240A0003" w:tentative="1">
+      <w:start w:val="1"/>
+      <w:numFmt w:val="bullet"/>
+      <w:lvlText w:val="o"/>
+      <w:lvlJc w:val="left"/>
+      <w:pPr>
+        <w:ind w:left="3600" w:hanging="360"/>
+      </w:pPr>
+      <w:rPr>
+        <w:rFonts w:ascii="Courier New" w:hAnsi="Courier New" w:cs="Courier New" w:hint="default"/>
+      </w:rPr>
+    </w:lvl>
+    <w:lvl w:ilvl="5" w:tplc="240A0005" w:tentative="1">
+      <w:start w:val="1"/>
+      <w:numFmt w:val="bullet"/>
+      <w:lvlText w:val=""/>
+      <w:lvlJc w:val="left"/>
+      <w:pPr>
+        <w:ind w:left="4320" w:hanging="360"/>
+      </w:pPr>
+      <w:rPr>
+        <w:rFonts w:ascii="Wingdings" w:hAnsi="Wingdings" w:hint="default"/>
+      </w:rPr>
+    </w:lvl>
+    <w:lvl w:ilvl="6" w:tplc="240A0001" w:tentative="1">
+      <w:start w:val="1"/>
+      <w:numFmt w:val="bullet"/>
+      <w:lvlText w:val=""/>
+      <w:lvlJc w:val="left"/>
+      <w:pPr>
+        <w:ind w:left="5040" w:hanging="360"/>
+      </w:pPr>
+      <w:rPr>
+        <w:rFonts w:ascii="Symbol" w:hAnsi="Symbol" w:hint="default"/>
+      </w:rPr>
+    </w:lvl>
+    <w:lvl w:ilvl="7" w:tplc="240A0003" w:tentative="1">
+      <w:start w:val="1"/>
+      <w:numFmt w:val="bullet"/>
+      <w:lvlText w:val="o"/>
+      <w:lvlJc w:val="left"/>
+      <w:pPr>
+        <w:ind w:left="5760" w:hanging="360"/>
+      </w:pPr>
+      <w:rPr>
+        <w:rFonts w:ascii="Courier New" w:hAnsi="Courier New" w:cs="Courier New" w:hint="default"/>
+      </w:rPr>
+    </w:lvl>
+    <w:lvl w:ilvl="8" w:tplc="240A0005" w:tentative="1">
+      <w:start w:val="1"/>
+      <w:numFmt w:val="bullet"/>
+      <w:lvlText w:val=""/>
+      <w:lvlJc w:val="left"/>
+      <w:pPr>
+        <w:ind w:left="6480" w:hanging="360"/>
+      </w:pPr>
+      <w:rPr>
+        <w:rFonts w:ascii="Wingdings" w:hAnsi="Wingdings" w:hint="default"/>
+      </w:rPr>
+    </w:lvl>
+  </w:abstractNum>
+  <w:num w:numId="1" w16cid:durableId="389891209">
+    <w:abstractNumId w:val="0"/>
+  </w:num>
+</w:numbering>
 </file>
 
 <file path=word/styles.xml><?xml version="1.0" encoding="utf-8"?>
@@ -1313,7 +2521,6 @@
   <w:style w:type="character" w:default="1" w:styleId="Fuentedeprrafopredeter">
     <w:name w:val="Default Paragraph Font"/>
     <w:uiPriority w:val="1"/>
-    <w:semiHidden/>
     <w:unhideWhenUsed/>
   </w:style>
   <w:style w:type="table" w:default="1" w:styleId="Tablanormal">
@@ -1967,4 +3174,16 @@
     </a:ext>
   </a:extLst>
 </a:theme>
+</file>
+
+<file path=customXml/item1.xml><?xml version="1.0" encoding="utf-8"?>
+<b:Sources xmlns:b="http://schemas.openxmlformats.org/officeDocument/2006/bibliography" xmlns="http://schemas.openxmlformats.org/officeDocument/2006/bibliography" SelectedStyle="\APASixthEditionOfficeOnline.xsl" StyleName="APA" Version="6"/>
+</file>
+
+<file path=customXml/itemProps1.xml><?xml version="1.0" encoding="utf-8"?>
+<ds:datastoreItem xmlns:ds="http://schemas.openxmlformats.org/officeDocument/2006/customXml" ds:itemID="{11AC0B93-CF09-4694-A44C-33C60C9E6EE1}">
+  <ds:schemaRefs>
+    <ds:schemaRef ds:uri="http://schemas.openxmlformats.org/officeDocument/2006/bibliography"/>
+  </ds:schemaRefs>
+</ds:datastoreItem>
 </file>
</xml_diff>